<commit_message>
Synchronize accessibility document interviews 01–02
</commit_message>
<xml_diff>
--- a/Interview_Transcripts_Accessibility.docx
+++ b/Interview_Transcripts_Accessibility.docx
@@ -17,7 +17,7 @@
     </w:p>
     <w:p>
       <w:r>
-        <w:t>Research ethics note: The interview participants are anonymized. Transcripts 01 and 02 were interviewer-corrected. Interviews 03 and 04 were reconstructed or edited from automatic captions, and may paraphrase responses; they should not be treated as fully verified verbatim records. Audio recordings take precedence for exact quotations.</w:t>
+        <w:t>Research ethics note: Participants are identified by number rather than name. Interviews 01 and 02 are caption-assisted, interviewer-edited working transcripts; uncertain phrases are marked and they have not been independently verified word for word. Interviews 03 and 04 contain edited or paraphrased responses from automatic captions; consult the original recordings before quoting exact wording.</w:t>
       </w:r>
     </w:p>
     <w:p>
@@ -29,678 +29,312 @@
       </w:r>
     </w:p>
     <w:p>
-      <w:pPr>
-        <w:keepLines/>
-      </w:pPr>
+      <w:pPr/>
       <w:r>
         <w:t>FAR FROM HOME — INTERVIEW 01</w:t>
       </w:r>
     </w:p>
     <w:p>
-      <w:pPr>
-        <w:keepLines/>
-      </w:pPr>
-      <w:r>
-        <w:t>Working transcript (edited from user-provided subtitle transcription)</w:t>
+      <w:pPr/>
+      <w:r>
+        <w:t>Caption-assisted working transcript, edited by the interviewer. This is not a verified word-for-word transcript.</w:t>
       </w:r>
     </w:p>
     <w:p>
-      <w:pPr>
-        <w:keepLines/>
-      </w:pPr>
-      <w:r>
-        <w:t>Updated by the interviewer. Transcript is edited from captions and is not time-aligned.</w:t>
+      <w:pPr/>
+      <w:r>
+        <w:t>Speaker labels are anonymized. Some wording may be uncertain; review the recording before citing an exact quotation.</w:t>
       </w:r>
     </w:p>
     <w:p>
-      <w:pPr>
-        <w:keepLines/>
-      </w:pPr>
-      <w:r>
-        <w:rPr>
-          <w:b/>
-        </w:rPr>
-        <w:t xml:space="preserve">01. Interviewer: </w:t>
-      </w:r>
-      <w:r>
-        <w:t>Where are you originally from, and how long have you been studying at Texas Tech University?</w:t>
+      <w:pPr/>
+      <w:r>
+        <w:t>01. Interviewer: Where are you originally from, and how long have you been studying at Texas Tech University?</w:t>
       </w:r>
     </w:p>
     <w:p>
-      <w:pPr>
-        <w:keepLines/>
-      </w:pPr>
-      <w:r>
-        <w:rPr>
-          <w:b/>
-        </w:rPr>
-        <w:t xml:space="preserve">Interviewee: </w:t>
-      </w:r>
-      <w:r>
-        <w:t>I'm originally from Nigeria, but then I stayed in Virginia for about two years before moving to Texas. I've been studying at Texas Tech for two month now.</w:t>
+      <w:pPr/>
+      <w:r>
+        <w:t>PARTICIPANT 01: I'm originally from Nigeria, but then I stayed in Virginia for about two years before moving to Texas. I've been studying at Texas Tech for two month now.</w:t>
       </w:r>
     </w:p>
     <w:p>
-      <w:pPr>
-        <w:keepLines/>
-      </w:pPr>
-      <w:r>
-        <w:rPr>
-          <w:b/>
-        </w:rPr>
-        <w:t xml:space="preserve">02. Interviewer: </w:t>
-      </w:r>
-      <w:r>
-        <w:t>Before coming to Texas Tech, what did you expect life in Lubbock to be like?</w:t>
+      <w:pPr/>
+      <w:r>
+        <w:t>02. Interviewer: Before coming to Texas Tech, what did you expect life in Lubbock to be like?</w:t>
       </w:r>
     </w:p>
     <w:p>
-      <w:pPr>
-        <w:keepLines/>
-      </w:pPr>
-      <w:r>
-        <w:rPr>
-          <w:b/>
-        </w:rPr>
-        <w:t xml:space="preserve">Interviewee: </w:t>
-      </w:r>
-      <w:r>
-        <w:t>I thought it was going to be boring, deserted, and, yeah, extra boring.</w:t>
+      <w:pPr/>
+      <w:r>
+        <w:t>PARTICIPANT 01: I thought it was going to be boring, deserted, and, yeah, extra boring.</w:t>
       </w:r>
     </w:p>
     <w:p>
-      <w:pPr>
-        <w:keepLines/>
-      </w:pPr>
-      <w:r>
-        <w:rPr>
-          <w:b/>
-        </w:rPr>
-        <w:t xml:space="preserve">03. Interviewer: </w:t>
-      </w:r>
-      <w:r>
-        <w:t>What surprised you most when you first arrived at Texas Tech?</w:t>
+      <w:pPr/>
+      <w:r>
+        <w:t>03. Interviewer: What surprised you most when you first arrived at Texas Tech?</w:t>
       </w:r>
     </w:p>
     <w:p>
-      <w:pPr>
-        <w:keepLines/>
-      </w:pPr>
-      <w:r>
-        <w:rPr>
-          <w:b/>
-        </w:rPr>
-        <w:t xml:space="preserve">Interviewee: </w:t>
-      </w:r>
-      <w:r>
-        <w:t>The community. Like, a lot of kind people, and it has a very good diversity rate. So there's always a place for everybody. And yeah, there are actually people here.</w:t>
+      <w:pPr/>
+      <w:r>
+        <w:t>PARTICIPANT 01: The community. Like, a lot of kind people, and it has a very good diversity rate. So there's always a place for everybody. And yeah, there are actually people here.</w:t>
       </w:r>
     </w:p>
     <w:p>
-      <w:pPr>
-        <w:keepLines/>
-      </w:pPr>
-      <w:r>
-        <w:rPr>
-          <w:b/>
-        </w:rPr>
-        <w:t xml:space="preserve">04. Interviewer: </w:t>
-      </w:r>
-      <w:r>
-        <w:t>What has been the most difficult part of adjusting to life in Lubbock?</w:t>
+      <w:pPr/>
+      <w:r>
+        <w:t>04. Interviewer: What has been the most difficult part of adjusting to life in Lubbock?</w:t>
       </w:r>
     </w:p>
     <w:p>
-      <w:pPr>
-        <w:keepLines/>
-      </w:pPr>
-      <w:r>
-        <w:rPr>
-          <w:b/>
-        </w:rPr>
-        <w:t xml:space="preserve">Interviewee: </w:t>
-      </w:r>
-      <w:r>
-        <w:t>When I miss my family, and there's not so much to do. Like, I mean, there is, but compared to where I'm coming from, there isn't so much to do.</w:t>
+      <w:pPr/>
+      <w:r>
+        <w:t>PARTICIPANT 01: When I miss my family, and there's not so much to do. Like, I mean, there is, but compared to where I'm coming from, there isn't so much to do.</w:t>
       </w:r>
     </w:p>
     <w:p>
-      <w:pPr>
-        <w:keepLines/>
-      </w:pPr>
-      <w:r>
-        <w:rPr>
-          <w:b/>
-        </w:rPr>
-        <w:t xml:space="preserve">05. Interviewer: </w:t>
-      </w:r>
-      <w:r>
-        <w:t>Have you experienced any cultural differences that affected your everyday life?</w:t>
+      <w:pPr/>
+      <w:r>
+        <w:t>05. Interviewer: Have you experienced any cultural differences that affected your everyday life?</w:t>
       </w:r>
     </w:p>
     <w:p>
-      <w:pPr>
-        <w:keepLines/>
-      </w:pPr>
-      <w:r>
-        <w:rPr>
-          <w:b/>
-        </w:rPr>
-        <w:t xml:space="preserve">Interviewee: </w:t>
-      </w:r>
-      <w:r>
-        <w:t>Not exactly. It's just like the people here are more friendly. I'm used to people being so focused on their lives in Virginia. So when I came here, people actually greet you. It was kind of different, but not life-changing different.</w:t>
+      <w:pPr/>
+      <w:r>
+        <w:t>PARTICIPANT 01: Not exactly. It's just like the people here are more friendly. I'm used to people being so focused on their lives in Virginia. So when I came here, people actually greet you. It was kind of different, but not life-changing different.</w:t>
       </w:r>
     </w:p>
     <w:p>
-      <w:pPr>
-        <w:keepLines/>
-      </w:pPr>
-      <w:r>
-        <w:rPr>
-          <w:b/>
-        </w:rPr>
-        <w:t xml:space="preserve">06. Interviewer: </w:t>
-      </w:r>
-      <w:r>
-        <w:t>Can you describe a time when you felt particularly welcomed or excluded at Texas Tech?</w:t>
+      <w:pPr/>
+      <w:r>
+        <w:t>06. Interviewer: Can you describe a time when you felt particularly welcomed or excluded at Texas Tech?</w:t>
       </w:r>
     </w:p>
     <w:p>
-      <w:pPr>
-        <w:keepLines/>
-      </w:pPr>
-      <w:r>
-        <w:rPr>
-          <w:b/>
-        </w:rPr>
-        <w:t xml:space="preserve">Interviewee: </w:t>
-      </w:r>
-      <w:r>
-        <w:t>Welcomed? Like, you always feel welcomed at all the events. From the International Student Office to the normal everyday clubs, there will always be somebody to come greet you, come talk to you in every single activity. So I've never felt excluded from any events.</w:t>
+      <w:pPr/>
+      <w:r>
+        <w:t>PARTICIPANT 01: Welcomed? Like, you always feel welcomed at all the events. From the International Student Office to the normal everyday clubs, there will always be somebody to come greet you, come talk to you in every single activity. So I've never felt excluded from any events.</w:t>
       </w:r>
     </w:p>
     <w:p>
-      <w:pPr>
-        <w:keepLines/>
-      </w:pPr>
-      <w:r>
-        <w:rPr>
-          <w:b/>
-        </w:rPr>
-        <w:t xml:space="preserve">07. Interviewer: </w:t>
-      </w:r>
-      <w:r>
-        <w:t>What people, activities, or organizations have helped you feel connected to the Texas Tech community?</w:t>
+      <w:pPr/>
+      <w:r>
+        <w:t>07. Interviewer: What people, activities, or organizations have helped you feel connected to the Texas Tech community?</w:t>
       </w:r>
     </w:p>
     <w:p>
-      <w:pPr>
-        <w:keepLines/>
-      </w:pPr>
-      <w:r>
-        <w:rPr>
-          <w:b/>
-        </w:rPr>
-        <w:lastRenderedPageBreak/>
-        <w:t xml:space="preserve">Interviewee: </w:t>
-      </w:r>
-      <w:r>
-        <w:t>There's TOR, the National Society of Black Engineers, the Society of Women Engineers, and the African Student Organization.</w:t>
+      <w:pPr/>
+      <w:r>
+        <w:t>PARTICIPANT 01: There's TOR, the National Society of Black Engineers, the Society of Women Engineers, and the African Student Organization.</w:t>
       </w:r>
     </w:p>
     <w:p>
-      <w:pPr>
-        <w:keepLines/>
-      </w:pPr>
-      <w:r>
-        <w:t>Follow-up — What about people?</w:t>
+      <w:pPr/>
+      <w:r>
+        <w:t>Follow-up — Interviewer: What about people?</w:t>
       </w:r>
     </w:p>
     <w:p>
-      <w:pPr>
-        <w:keepLines/>
-      </w:pPr>
-      <w:r>
-        <w:t>My professors are pretty friendly. Then my classmates, they also get us to work in teams, so that helps you know more people. And yeah, the people here are generally kind.</w:t>
+      <w:pPr/>
+      <w:r>
+        <w:t>PARTICIPANT 01: My professors are pretty friendly. Then my classmates, they also get us to work in teams, so that helps you know more people. And yeah, the people here are generally kind.</w:t>
       </w:r>
     </w:p>
     <w:p>
-      <w:pPr>
-        <w:keepLines/>
-      </w:pPr>
-      <w:r>
-        <w:rPr>
-          <w:b/>
-        </w:rPr>
-        <w:t xml:space="preserve">08. Interviewer: </w:t>
-      </w:r>
-      <w:r>
-        <w:t>Are there particular places on campus or around Lubbock where you feel most comfortable? What makes those places special?</w:t>
+      <w:pPr/>
+      <w:r>
+        <w:t>08. Interviewer: Are there particular places on campus or around Lubbock where you feel most comfortable? What makes those places special?</w:t>
       </w:r>
     </w:p>
     <w:p>
-      <w:pPr>
-        <w:keepLines/>
-      </w:pPr>
-      <w:r>
-        <w:rPr>
-          <w:b/>
-        </w:rPr>
-        <w:t xml:space="preserve">Interviewee: </w:t>
-      </w:r>
-      <w:r>
-        <w:t>I like the library 'cause you get to see a lot of people, and it's nice to study. Then, to be honest, my classes actually feel comfortable and nice for me. I don't really go off campus, so no answer to Lubbock in general. Oh yeah, and the gym. The gym also makes me feel very comfortable and welcome. And then the Texas Tech games that I've been to, they're also really fun.</w:t>
+      <w:pPr/>
+      <w:r>
+        <w:t>PARTICIPANT 01: I like the library 'cause you get to see a lot of people, and it's nice to study. Then, to be honest, my classes actually feel comfortable and nice for me. I don't really go off campus, so no answer to Lubbock in general. Oh yeah, and the gym. The gym also makes me feel very comfortable and welcome. And then the Texas Tech games that I've been to, they're also really fun.</w:t>
       </w:r>
     </w:p>
     <w:p>
-      <w:pPr>
-        <w:keepLines/>
-      </w:pPr>
-      <w:r>
-        <w:rPr>
-          <w:b/>
-        </w:rPr>
-        <w:t xml:space="preserve">09. Interviewer: </w:t>
-      </w:r>
-      <w:r>
-        <w:t>Would you consider Lubbock or Texas Tech your second home? Why or why not?</w:t>
+      <w:pPr/>
+      <w:r>
+        <w:t>09. Interviewer: Would you consider Lubbock or Texas Tech your second home? Why or why not?</w:t>
       </w:r>
     </w:p>
     <w:p>
-      <w:pPr>
-        <w:keepLines/>
-      </w:pPr>
-      <w:r>
-        <w:rPr>
-          <w:b/>
-        </w:rPr>
-        <w:t xml:space="preserve">Interviewee: </w:t>
-      </w:r>
-      <w:r>
-        <w:t>I think consider It's my third home, because my first home is Nigeria and my second home is Virginia, because that's where my family members are. I don't really have family or close friends in Lubbock. That's just why I feel like the people there make a home, and the people that are making home for me are not here, so.</w:t>
+      <w:pPr/>
+      <w:r>
+        <w:t>PARTICIPANT 01: [Opening words unclear in captions.] It's my third home, because my first home is Nigeria and my second home is Virginia, because that's where my family members are. I don't really have family or close friends in Lubbock. That's just why I feel like the people there make a home, and the people that are making home for me are not here, so.</w:t>
       </w:r>
     </w:p>
     <w:p>
-      <w:pPr>
-        <w:keepLines/>
-      </w:pPr>
-      <w:r>
-        <w:rPr>
-          <w:b/>
-        </w:rPr>
-        <w:t xml:space="preserve">10. Interviewer: </w:t>
-      </w:r>
-      <w:r>
-        <w:t>Looking back on your experience, what advice would you give to a new international student struggling to feel at home?</w:t>
+      <w:pPr/>
+      <w:r>
+        <w:t>10. Interviewer: Looking back on your experience, what advice would you give to a new international student struggling to feel at home?</w:t>
       </w:r>
     </w:p>
     <w:p>
-      <w:pPr>
-        <w:keepLines/>
-      </w:pPr>
-      <w:r>
-        <w:rPr>
-          <w:b/>
-        </w:rPr>
-        <w:t xml:space="preserve">Interviewee: </w:t>
-      </w:r>
-      <w:r>
-        <w:t>I don't think they should have problems, 'cause people will always talk to you. You can make friends at international student events. So yeah, I think it's important to go to events, not so many that you're distracted from your academics, but you should definitely go. There will always be people there willing to welcome you and stuff. Yeah.</w:t>
+      <w:pPr/>
+      <w:r>
+        <w:t>PARTICIPANT 01: I don't think they should have problems, 'cause people will always talk to you. You can make friends at international student events. So yeah, I think it's important to go to events, not so many that you're distracted from your academics, but you should definitely go. There will always be people there willing to welcome you and stuff. Yeah.</w:t>
       </w:r>
     </w:p>
     <w:p>
-      <w:pPr>
-        <w:keepLines/>
-      </w:pPr>
-      <w:r>
-        <w:rPr>
-          <w:b/>
-        </w:rPr>
-        <w:t xml:space="preserve">Interviewer: </w:t>
-      </w:r>
-      <w:r>
-        <w:t>Okay, thank you very much for your time. I really appreciate it.</w:t>
+      <w:pPr/>
+      <w:r>
+        <w:t>Interviewer: Okay, thank you very much for your time. I really appreciate it.</w:t>
       </w:r>
     </w:p>
     <w:p>
-      <w:r>
-        <w:br w:type="page"/>
+      <w:pPr>
+        <w:pStyle w:val="Heading1"/>
+      </w:pPr>
+      <w:r>
+        <w:lastRenderedPageBreak/>
+        <w:t>Interview 02</w:t>
       </w:r>
     </w:p>
     <w:p>
-      <w:pPr>
-        <w:pStyle w:val="Heading1"/>
-      </w:pPr>
-      <w:r>
-        <w:lastRenderedPageBreak/>
-        <w:t>Interview 02</w:t>
+      <w:pPr/>
+      <w:r>
+        <w:t>FAR FROM HOME — INTERVIEW 02</w:t>
       </w:r>
     </w:p>
     <w:p>
-      <w:pPr>
-        <w:keepLines/>
-      </w:pPr>
-      <w:r>
-        <w:t>FAR FROM HOME — INTERVIEW 02</w:t>
+      <w:pPr/>
+      <w:r>
+        <w:t>Caption-assisted working transcript, lightly edited for readability; not a verified verbatim record.</w:t>
       </w:r>
     </w:p>
     <w:p>
-      <w:pPr>
-        <w:keepLines/>
-      </w:pPr>
-      <w:r>
-        <w:t>Working transcript edited from supplied SRT subtitles.</w:t>
+      <w:pPr/>
+      <w:r>
+        <w:t>Recording length: approximately 5 minutes 51 seconds.</w:t>
       </w:r>
     </w:p>
     <w:p>
-      <w:pPr>
-        <w:keepLines/>
-      </w:pPr>
-      <w:r>
-        <w:t>Recording length: approximately 5 minutes 51 seconds.</w:t>
+      <w:pPr/>
+      <w:r>
+        <w:t>Speaker labels are anonymized. Bracketed phrases mark uncertain wording in the captions. Consult the recording before citing exact words.</w:t>
       </w:r>
     </w:p>
     <w:p>
-      <w:pPr>
-        <w:keepLines/>
-      </w:pPr>
-      <w:r>
-        <w:t>The transcript has light punctuation/grammar smoothing and is not an exact verbatim record.</w:t>
+      <w:pPr/>
+      <w:r>
+        <w:t>01. Interviewer: Where are you originally from, and how long have you been studying at Texas Tech University?</w:t>
       </w:r>
     </w:p>
     <w:p>
-      <w:pPr>
-        <w:keepLines/>
-      </w:pPr>
-      <w:r>
-        <w:t>Bracketed phrases indicate uncertainty in the automated captions; verify against the source audio before quoting directly.</w:t>
+      <w:pPr/>
+      <w:r>
+        <w:t>PARTICIPANT 02: I'm originally from Nigeria, but I've also stayed in Canada for a few years. I've been studying at Texas Tech University for about three months.</w:t>
       </w:r>
     </w:p>
     <w:p>
-      <w:pPr>
-        <w:keepLines/>
-      </w:pPr>
-      <w:r>
-        <w:rPr>
-          <w:b/>
-        </w:rPr>
-        <w:t xml:space="preserve">01. Interviewer: </w:t>
-      </w:r>
-      <w:r>
-        <w:t>Where are you originally from, and how long have you been studying at Texas Tech University?</w:t>
+      <w:pPr/>
+      <w:r>
+        <w:t>02. Interviewer: Before coming to Texas Tech, what did you expect life in Lubbock to be like?</w:t>
       </w:r>
     </w:p>
     <w:p>
-      <w:pPr>
-        <w:keepLines/>
-      </w:pPr>
-      <w:r>
-        <w:rPr>
-          <w:b/>
-        </w:rPr>
-        <w:t xml:space="preserve">Interviewee: </w:t>
-      </w:r>
-      <w:r>
-        <w:t>I'm originally from Nigeria, but I've also stayed in Canada for a few years. I've been studying at Texas Tech University for about three months.</w:t>
+      <w:pPr/>
+      <w:r>
+        <w:t>PARTICIPANT 02: I thought Lubbock was like a deserted area. It had nothing. There were not a lot of things to do. It wasn't a fun place to be. That's really what I thought about Lubbock in general.</w:t>
       </w:r>
     </w:p>
     <w:p>
-      <w:pPr>
-        <w:keepLines/>
-      </w:pPr>
-      <w:r>
-        <w:rPr>
-          <w:b/>
-        </w:rPr>
-        <w:t xml:space="preserve">02. Interviewer: </w:t>
-      </w:r>
-      <w:r>
-        <w:t>Before coming to Texas Tech, what did you expect life in Lubbock to be like?</w:t>
+      <w:pPr/>
+      <w:r>
+        <w:t>03. Interviewer: What surprised you most when you first arrived at Texas Tech?</w:t>
       </w:r>
     </w:p>
     <w:p>
-      <w:pPr>
-        <w:keepLines/>
-      </w:pPr>
-      <w:r>
-        <w:rPr>
-          <w:b/>
-        </w:rPr>
-        <w:t xml:space="preserve">Interviewee: </w:t>
-      </w:r>
-      <w:r>
-        <w:t>I thought Lubbock was like a deserted area. It had nothing. There were not a lot of things to do. It wasn't a fun place to be. That's really what I thought about Lubbock in general.</w:t>
+      <w:pPr/>
+      <w:r>
+        <w:t>PARTICIPANT 02: I was surprised by the community at Texas Tech University: how friendly everyone is, how cheerful everyone is, and also how good the university is. Initially I thought the university wasn't very good, but now my opinion about it has changed.</w:t>
       </w:r>
     </w:p>
     <w:p>
-      <w:pPr>
-        <w:keepLines/>
-      </w:pPr>
-      <w:r>
-        <w:rPr>
-          <w:b/>
-        </w:rPr>
-        <w:t xml:space="preserve">03. Interviewer: </w:t>
-      </w:r>
-      <w:r>
-        <w:t>What surprised you most when you first arrived at Texas Tech?</w:t>
+      <w:pPr/>
+      <w:r>
+        <w:t>04. Interviewer: What has been the most difficult part of adjusting to life in Lubbock?</w:t>
       </w:r>
     </w:p>
     <w:p>
-      <w:pPr>
-        <w:keepLines/>
-      </w:pPr>
-      <w:r>
-        <w:rPr>
-          <w:b/>
-        </w:rPr>
-        <w:t xml:space="preserve">Interviewee: </w:t>
-      </w:r>
-      <w:r>
-        <w:t>I was surprised by the community at Texas Tech University: how friendly everyone is, how cheerful everyone is, and also how good the university is. Initially I thought the university wasn't very good, but now my opinion about it has changed.</w:t>
+      <w:pPr/>
+      <w:r>
+        <w:t>PARTICIPANT 02: Initially it was hard for me to make friends, talk to people. But now I've gotten better at it, and it's been going great. The people have been very welcoming and good to me.</w:t>
       </w:r>
     </w:p>
     <w:p>
-      <w:pPr>
-        <w:keepLines/>
-      </w:pPr>
-      <w:r>
-        <w:rPr>
-          <w:b/>
-        </w:rPr>
-        <w:t xml:space="preserve">04. Interviewer: </w:t>
-      </w:r>
-      <w:r>
-        <w:t>What has been the most difficult part of adjusting to life in Lubbock?</w:t>
+      <w:pPr/>
+      <w:r>
+        <w:t>05. Interviewer: Have you experienced any cultural differences that affected your everyday life?</w:t>
       </w:r>
     </w:p>
     <w:p>
-      <w:pPr>
-        <w:keepLines/>
-      </w:pPr>
-      <w:r>
-        <w:rPr>
-          <w:b/>
-        </w:rPr>
-        <w:t xml:space="preserve">Interviewee: </w:t>
-      </w:r>
-      <w:r>
-        <w:t>Initially it was hard for me to make friends, talk to people. But now I've gotten better at it, and it's been going great. The people have been very welcoming and good to me.</w:t>
+      <w:pPr/>
+      <w:r>
+        <w:t>PARTICIPANT 02: I wouldn't say it has affected my everyday life. A cultural difference is how people take political differences as an identity. You can see serious and heated debates around politics, which is something I wasn't used to. [Several words unclear in captions.] I don't really take it to heart. I don't really make it my identity.</w:t>
       </w:r>
     </w:p>
     <w:p>
-      <w:pPr>
-        <w:keepLines/>
-      </w:pPr>
-      <w:r>
-        <w:rPr>
-          <w:b/>
-        </w:rPr>
-        <w:t xml:space="preserve">05. Interviewer: </w:t>
-      </w:r>
-      <w:r>
-        <w:t>Have you experienced any cultural differences that affected your everyday life?</w:t>
+      <w:pPr/>
+      <w:r>
+        <w:t>06. Interviewer: Can you describe a time when you felt particularly welcomed or excluded at Texas Tech?</w:t>
       </w:r>
     </w:p>
     <w:p>
-      <w:pPr>
-        <w:keepLines/>
-      </w:pPr>
-      <w:r>
-        <w:rPr>
-          <w:b/>
-        </w:rPr>
-        <w:t xml:space="preserve">Interviewee: </w:t>
-      </w:r>
-      <w:r>
-        <w:t>I wouldn't say it has affected my everyday life. A cultural difference is how people take political differences as an identity. You can see serious and heated debates around politics, which is something I wasn't used to. [Several words unclear in captions.] I don't really take it to heart. I don't really make it my identity.</w:t>
+      <w:pPr/>
+      <w:r>
+        <w:t>PARTICIPANT 02: I don't think I've ever felt particularly excluded at any event on Texas Tech. I've felt welcomed at various events, including my classes, hackathons that I've attended, and even the church that I go to, TOR. It has been very welcoming for me.</w:t>
       </w:r>
     </w:p>
     <w:p>
-      <w:pPr>
-        <w:keepLines/>
-      </w:pPr>
-      <w:r>
-        <w:rPr>
-          <w:b/>
-        </w:rPr>
-        <w:t xml:space="preserve">06. Interviewer: </w:t>
-      </w:r>
-      <w:r>
-        <w:t>Can you describe a time when you felt particularly welcomed or excluded at Texas Tech?</w:t>
+      <w:pPr/>
+      <w:r>
+        <w:t>07. Interviewer: What people, activities, or organizations have helped you feel connected to the Texas Tech community?</w:t>
       </w:r>
     </w:p>
     <w:p>
-      <w:pPr>
-        <w:keepLines/>
-      </w:pPr>
-      <w:r>
-        <w:rPr>
-          <w:b/>
-        </w:rPr>
-        <w:t xml:space="preserve">Interviewee: </w:t>
-      </w:r>
-      <w:r>
-        <w:t>I don't think I've ever felt particularly excluded at any event on Texas Tech. I've felt welcomed at various events, including my classes, hackathons that I've attended, and even the church that I go to, TOR. It has been very welcoming for me.</w:t>
+      <w:pPr/>
+      <w:r>
+        <w:t>PARTICIPANT 02: I haven't really joined any club activities for now, but some of the things that have made me feel connected to the Texas Tech community are probably the National Society of Black Engineers, the various events that I go to, the library workshops where I learn new things about technology, and my church. Our church has made me feel connected to Lubbock and Texas Tech in general.</w:t>
       </w:r>
     </w:p>
     <w:p>
-      <w:pPr>
-        <w:keepLines/>
-      </w:pPr>
-      <w:r>
-        <w:rPr>
-          <w:b/>
-        </w:rPr>
-        <w:t xml:space="preserve">07. Interviewer: </w:t>
-      </w:r>
-      <w:r>
-        <w:t>What people, activities, or organizations have helped you feel connected to the Texas Tech community?</w:t>
+      <w:pPr/>
+      <w:r>
+        <w:t>08. Interviewer: Are there particular places on campus or around Lubbock where you feel most comfortable? What makes those places special?</w:t>
       </w:r>
     </w:p>
     <w:p>
-      <w:pPr>
-        <w:keepLines/>
-      </w:pPr>
-      <w:r>
-        <w:rPr>
-          <w:b/>
-        </w:rPr>
-        <w:lastRenderedPageBreak/>
-        <w:t xml:space="preserve">Interviewee: </w:t>
-      </w:r>
-      <w:r>
-        <w:t>I haven't really joined any club activities for now, but some of the things that have made me feel connected to the Texas Tech community are probably the National Society of Black Engineers, the various events that I go to, the library workshops where I learn new things about technology, and my church. Our church has made me feel connected to Lubbock and Texas Tech in general.</w:t>
+      <w:pPr/>
+      <w:r>
+        <w:t>PARTICIPANT 02: I'd say probably the library, because that's where I go every day. That's where I study most times. I don't really go out that often. The library is a very good place for me.</w:t>
       </w:r>
     </w:p>
     <w:p>
-      <w:pPr>
-        <w:keepLines/>
-      </w:pPr>
-      <w:r>
-        <w:rPr>
-          <w:b/>
-        </w:rPr>
-        <w:t xml:space="preserve">08. Interviewer: </w:t>
-      </w:r>
-      <w:r>
-        <w:t>Are there particular places on campus or around Lubbock where you feel most comfortable? What makes those places special?</w:t>
+      <w:pPr/>
+      <w:r>
+        <w:t>09. Interviewer: Would you consider Lubbock or Texas Tech your second home? Why or why not?</w:t>
       </w:r>
     </w:p>
     <w:p>
-      <w:pPr>
-        <w:keepLines/>
-      </w:pPr>
-      <w:r>
-        <w:rPr>
-          <w:b/>
-        </w:rPr>
-        <w:t xml:space="preserve">Interviewee: </w:t>
-      </w:r>
-      <w:r>
-        <w:t>I'd say probably the library, because that's where I go every day. That's where I study most times. I don't really go out that often. The library is a very good place for me.</w:t>
+      <w:pPr/>
+      <w:r>
+        <w:t>PARTICIPANT 02: For now, not really, because [unclear phrase]. If I were to leave the next day [unclear phrase]. That doesn't mean that I haven't enjoyed every single time I've been here. But to call it my second home, I wouldn't really say so, because I do have family back in Houston, and I really love to be around them.</w:t>
       </w:r>
     </w:p>
     <w:p>
-      <w:pPr>
-        <w:keepLines/>
-      </w:pPr>
-      <w:r>
-        <w:rPr>
-          <w:b/>
-        </w:rPr>
-        <w:t xml:space="preserve">09. Interviewer: </w:t>
-      </w:r>
-      <w:r>
-        <w:t>Would you consider Lubbock or Texas Tech your second home? Why or why not?</w:t>
+      <w:pPr/>
+      <w:r>
+        <w:t>10. Interviewer: Looking back on your experience, what advice would you give to a new international student struggling to feel at home?</w:t>
       </w:r>
     </w:p>
     <w:p>
-      <w:pPr>
-        <w:keepLines/>
-      </w:pPr>
-      <w:r>
-        <w:rPr>
-          <w:b/>
-        </w:rPr>
-        <w:t xml:space="preserve">Interviewee: </w:t>
-      </w:r>
-      <w:r>
-        <w:t>For now, not really, because [unclear phrase]. If I were to leave the next day [unclear phrase]. That doesn't mean that I haven't enjoyed every single time I've been here. But to call it my second home, I wouldn't really say so, because I do have family back in Houston, and I really love to be around them.</w:t>
-      </w:r>
-    </w:p>
-    <w:p>
-      <w:pPr>
-        <w:keepLines/>
-      </w:pPr>
-      <w:r>
-        <w:rPr>
-          <w:b/>
-        </w:rPr>
-        <w:t xml:space="preserve">10. Interviewer: </w:t>
-      </w:r>
-      <w:r>
-        <w:t>Looking back on your experience, what advice would you give to a new international student struggling to feel at home?</w:t>
-      </w:r>
-    </w:p>
-    <w:p>
-      <w:pPr>
-        <w:keepLines/>
-      </w:pPr>
-      <w:r>
-        <w:rPr>
-          <w:b/>
-        </w:rPr>
-        <w:t xml:space="preserve">Interviewee: </w:t>
-      </w:r>
-      <w:r>
-        <w:t>I'd say be proactive. Everyone here is welcoming; everyone here is cheerful. [Some wording unclear in captions.] Always attend activities. It's not good to be alone on your own. Make friends.</w:t>
-      </w:r>
-    </w:p>
-    <w:p>
-      <w:r>
-        <w:br w:type="page"/>
+      <w:pPr/>
+      <w:r>
+        <w:t>PARTICIPANT 02: I'd say be proactive. Everyone here is welcoming; everyone here is cheerful. [Some wording unclear in captions.] Always attend activities. It's not good to be alone on your own. Make friends.</w:t>
       </w:r>
     </w:p>
     <w:p>

</xml_diff>